<commit_message>
docs: add system documentation and sample templates for banquet management processes
</commit_message>
<xml_diff>
--- a/backend-app/samples/BEO_Hoi_Nghi.docx
+++ b/backend-app/samples/BEO_Hoi_Nghi.docx
@@ -1,5 +1,47 @@
 
-<file path=word/document.xml><?xml version="1.0" encoding="utf-8"?>
+<file path=docProps\app.xml><?xml version="1.0" encoding="utf-8"?>
+<Properties xmlns="http://schemas.openxmlformats.org/officeDocument/2006/extended-properties" xmlns:vt="http://schemas.openxmlformats.org/officeDocument/2006/docPropsVTypes">
+  <Template>Normal</Template>
+  <TotalTime>0</TotalTime>
+  <Application>Microsoft Office Word</Application>
+  <DocSecurity>0</DocSecurity>
+  <ScaleCrop>false</ScaleCrop>
+  <LinksUpToDate>false</LinksUpToDate>
+  <SharedDoc>false</SharedDoc>
+  <HyperlinksChanged>false</HyperlinksChanged>
+  <AppVersion>12.0000</AppVersion>
+</Properties>
+</file>
+
+<file path=docProps\core.xml><?xml version="1.0" encoding="utf-8"?>
+<cp:coreProperties xmlns:cp="http://schemas.openxmlformats.org/package/2006/metadata/core-properties" xmlns:dc="http://purl.org/dc/elements/1.1/" xmlns:dcterms="http://purl.org/dc/terms/" xmlns:dcmitype="http://purl.org/dc/dcmitype/" xmlns:xsi="http://www.w3.org/2001/XMLSchema-instance">
+  <dc:creator>Van Luu</dc:creator>
+  <dcterms:created xsi:type="dcterms:W3CDTF">2026-06-04T11:18:28Z</dcterms:created>
+  <dcterms:modified xsi:type="dcterms:W3CDTF">2026-06-04T11:18:28Z</dcterms:modified>
+</cp:coreProperties>
+</file>
+
+<file path=docProps\custom.xml><?xml version="1.0" encoding="utf-8"?>
+<Properties xmlns="http://schemas.openxmlformats.org/officeDocument/2006/custom-properties" xmlns:vt="http://schemas.openxmlformats.org/officeDocument/2006/docPropsVTypes">
+  <property fmtid="{D5CDD505-2E9C-101B-9397-08002B2CF9AE}" pid="2" name="Converter">
+    <vt:lpwstr>SolidFramework v10.0.19910.1</vt:lpwstr>
+  </property>
+  <property fmtid="{D5CDD505-2E9C-101B-9397-08002B2CF9AE}" pid="3" name="Created">
+    <vt:filetime>2026-06-04T00:00:00Z</vt:filetime>
+  </property>
+  <property fmtid="{D5CDD505-2E9C-101B-9397-08002B2CF9AE}" pid="4" name="Creator">
+    <vt:lpwstr>Microsoft® Excel® 2019</vt:lpwstr>
+  </property>
+  <property fmtid="{D5CDD505-2E9C-101B-9397-08002B2CF9AE}" pid="5" name="LastSaved">
+    <vt:filetime>2026-06-04T00:00:00Z</vt:filetime>
+  </property>
+  <property fmtid="{D5CDD505-2E9C-101B-9397-08002B2CF9AE}" pid="6" name="Producer">
+    <vt:lpwstr>Microsoft® Excel® 2019</vt:lpwstr>
+  </property>
+</Properties>
+</file>
+
+<file path=word\document.xml><?xml version="1.0" encoding="utf-8"?>
 <w:document xmlns:mc="http://schemas.openxmlformats.org/markup-compatibility/2006" xmlns:ve="http://schemas.openxmlformats.org/markup-compatibility/2006" xmlns:o="urn:schemas-microsoft-com:office:office" xmlns:r="http://schemas.openxmlformats.org/officeDocument/2006/relationships" xmlns:m="http://schemas.openxmlformats.org/officeDocument/2006/math" xmlns:v="urn:schemas-microsoft-com:vml" xmlns:wp="http://schemas.openxmlformats.org/drawingml/2006/wordprocessingDrawing" xmlns:w10="urn:schemas-microsoft-com:office:word" xmlns:w="http://schemas.openxmlformats.org/wordprocessingml/2006/main" xmlns:wne="http://schemas.microsoft.com/office/word/2006/wordml" xmlns:a="http://schemas.openxmlformats.org/drawingml/2006/main" xmlns:pic="http://schemas.openxmlformats.org/drawingml/2006/picture" xmlns:wpg="http://schemas.microsoft.com/office/word/2010/wordprocessingGroup" xmlns:wps="http://schemas.microsoft.com/office/word/2010/wordprocessingShape" xmlns:w14="http://schemas.microsoft.com/office/word/2010/wordml" mc:Ignorable="w14" xml:space="preserve">
   <w:body>
     <w:p>
@@ -223,7 +265,7 @@
                 <w:sz w:val="10"/>
                 <w:u w:val="single"/>
               </w:rPr>
-              <w:t>{BenA_NhanVienPhuTrach}</w:t>
+              <w:t>{BenANhanVienPhuTrach}</w:t>
             </w:r>
           </w:p>
         </w:tc>
@@ -246,7 +288,7 @@
                 <w:sz w:val="10"/>
                 <w:u w:val="single"/>
               </w:rPr>
-              <w:t>Tel: {BenA_SDT_NhanVien}</w:t>
+              <w:t>Tel: {BenASDTNhanVien}</w:t>
             </w:r>
           </w:p>
         </w:tc>
@@ -579,7 +621,7 @@
                 <w:b/>
                 <w:sz w:val="10"/>
               </w:rPr>
-              <w:t>{TenCongTy}</w:t>
+              <w:t>{HDTenCty}</w:t>
             </w:r>
           </w:p>
         </w:tc>
@@ -900,7 +942,7 @@
           </w:tcPr>
           <w:p>
             <w:r>
-              <w:t>{NguoiGiaoDich}</w:t>
+              <w:t>{BenBDaiDien}</w:t>
             </w:r>
             <w:pPr>
               <w:pStyle w:val="TableParagraph"/>
@@ -1007,7 +1049,7 @@
           </w:tcPr>
           <w:p>
             <w:r>
-              <w:t>{BenB_DiaChi}</w:t>
+              <w:t>{BenBDiaChi}</w:t>
             </w:r>
             <w:pPr>
               <w:pStyle w:val="TableParagraph"/>
@@ -1445,7 +1487,7 @@
           </w:tcPr>
           <w:p>
             <w:r>
-              <w:t>{BenB_DienThoai}</w:t>
+              <w:t>{BenBDienThoai}</w:t>
             </w:r>
             <w:pPr>
               <w:pStyle w:val="TableParagraph"/>
@@ -4447,7 +4489,18 @@
 </w:document>
 </file>
 
-<file path=word/numbering.xml><?xml version="1.0" encoding="utf-8"?>
+<file path=word\fontTable.xml><?xml version="1.0" encoding="utf-8"?>
+<w:fonts xmlns:r="http://schemas.openxmlformats.org/officeDocument/2006/relationships" xmlns:w="http://schemas.openxmlformats.org/wordprocessingml/2006/main">
+  <w:font w:name="Times New Roman">
+    <w:altName w:val="Times New Roman"/>
+    <w:charset w:val="1"/>
+    <w:family w:val="roman"/>
+    <w:pitch w:val="variable"/>
+  </w:font>
+</w:fonts>
+</file>
+
+<file path=word\numbering.xml><?xml version="1.0" encoding="utf-8"?>
 <w:numbering xmlns:ve="http://schemas.openxmlformats.org/markup-compatibility/2006" xmlns:o="urn:schemas-microsoft-com:office:office" xmlns:r="http://schemas.openxmlformats.org/officeDocument/2006/relationships" xmlns:m="http://schemas.openxmlformats.org/officeDocument/2006/math" xmlns:v="urn:schemas-microsoft-com:vml" xmlns:wp="http://schemas.openxmlformats.org/drawingml/2006/wordprocessingDrawing" xmlns:w10="urn:schemas-microsoft-com:office:word" xmlns:w="http://schemas.openxmlformats.org/wordprocessingml/2006/main" xmlns:wne="http://schemas.microsoft.com/office/word/2006/wordml">
   <w:abstractNum w:abstractNumId="3">
     <w:multiLevelType w:val="hybridMultilevel"/>
@@ -4971,7 +5024,23 @@
 </w:numbering>
 </file>
 
-<file path=word/styles.xml><?xml version="1.0" encoding="utf-8"?>
+<file path=word\settings.xml><?xml version="1.0" encoding="utf-8"?>
+<w:settings xmlns:o="urn:schemas-microsoft-com:office:office" xmlns:r="http://schemas.openxmlformats.org/officeDocument/2006/relationships" xmlns:m="http://schemas.openxmlformats.org/officeDocument/2006/math" xmlns:v="urn:schemas-microsoft-com:vml" xmlns:w10="urn:schemas-microsoft-com:office:word" xmlns:w="http://schemas.openxmlformats.org/wordprocessingml/2006/main" xmlns:sl="http://schemas.openxmlformats.org/schemaLibrary/2006/main">
+  <w:zoom w:percent="120"/>
+  <w:defaultTabStop w:val="720"/>
+  <w:drawingGridHorizontalSpacing w:val="110"/>
+  <w:displayHorizontalDrawingGridEvery w:val="2"/>
+  <w:characterSpacingControl w:val="doNotCompress"/>
+  <w:compat>
+    <w:ulTrailSpace/>
+    <w:shapeLayoutLikeWW8/>
+    <w:useFELayout/>
+    <w:compatSetting w:val="14" w:uri="http://schemas.microsoft.com/office/word" w:name="compatibilityMode"/>
+  </w:compat>
+</w:settings>
+</file>
+
+<file path=word\styles.xml><?xml version="1.0" encoding="utf-8"?>
 <w:styles xmlns:r="http://schemas.openxmlformats.org/officeDocument/2006/relationships" xmlns:w="http://schemas.openxmlformats.org/wordprocessingml/2006/main">
   <w:docDefaults>
     <w:rPrDefault>
@@ -5054,7 +5123,7 @@
 </w:styles>
 </file>
 
-<file path=word/theme/theme1.xml><?xml version="1.0" encoding="utf-8"?>
+<file path=word\theme\theme1.xml><?xml version="1.0" encoding="utf-8"?>
 <a:theme xmlns:a="http://schemas.openxmlformats.org/drawingml/2006/main" name="Office Theme">
   <a:themeElements>
     <a:clrScheme name="Office">

</xml_diff>

<commit_message>
feat: add document templates and cleanup utility while removing obsolete schema documentation
</commit_message>
<xml_diff>
--- a/backend-app/samples/BEO_Hoi_Nghi.docx
+++ b/backend-app/samples/BEO_Hoi_Nghi.docx
@@ -1,47 +1,5 @@
 
-<file path=docProps\app.xml><?xml version="1.0" encoding="utf-8"?>
-<Properties xmlns="http://schemas.openxmlformats.org/officeDocument/2006/extended-properties" xmlns:vt="http://schemas.openxmlformats.org/officeDocument/2006/docPropsVTypes">
-  <Template>Normal</Template>
-  <TotalTime>0</TotalTime>
-  <Application>Microsoft Office Word</Application>
-  <DocSecurity>0</DocSecurity>
-  <ScaleCrop>false</ScaleCrop>
-  <LinksUpToDate>false</LinksUpToDate>
-  <SharedDoc>false</SharedDoc>
-  <HyperlinksChanged>false</HyperlinksChanged>
-  <AppVersion>12.0000</AppVersion>
-</Properties>
-</file>
-
-<file path=docProps\core.xml><?xml version="1.0" encoding="utf-8"?>
-<cp:coreProperties xmlns:cp="http://schemas.openxmlformats.org/package/2006/metadata/core-properties" xmlns:dc="http://purl.org/dc/elements/1.1/" xmlns:dcterms="http://purl.org/dc/terms/" xmlns:dcmitype="http://purl.org/dc/dcmitype/" xmlns:xsi="http://www.w3.org/2001/XMLSchema-instance">
-  <dc:creator>Van Luu</dc:creator>
-  <dcterms:created xsi:type="dcterms:W3CDTF">2026-06-04T11:18:28Z</dcterms:created>
-  <dcterms:modified xsi:type="dcterms:W3CDTF">2026-06-04T11:18:28Z</dcterms:modified>
-</cp:coreProperties>
-</file>
-
-<file path=docProps\custom.xml><?xml version="1.0" encoding="utf-8"?>
-<Properties xmlns="http://schemas.openxmlformats.org/officeDocument/2006/custom-properties" xmlns:vt="http://schemas.openxmlformats.org/officeDocument/2006/docPropsVTypes">
-  <property fmtid="{D5CDD505-2E9C-101B-9397-08002B2CF9AE}" pid="2" name="Converter">
-    <vt:lpwstr>SolidFramework v10.0.19910.1</vt:lpwstr>
-  </property>
-  <property fmtid="{D5CDD505-2E9C-101B-9397-08002B2CF9AE}" pid="3" name="Created">
-    <vt:filetime>2026-06-04T00:00:00Z</vt:filetime>
-  </property>
-  <property fmtid="{D5CDD505-2E9C-101B-9397-08002B2CF9AE}" pid="4" name="Creator">
-    <vt:lpwstr>Microsoft® Excel® 2019</vt:lpwstr>
-  </property>
-  <property fmtid="{D5CDD505-2E9C-101B-9397-08002B2CF9AE}" pid="5" name="LastSaved">
-    <vt:filetime>2026-06-04T00:00:00Z</vt:filetime>
-  </property>
-  <property fmtid="{D5CDD505-2E9C-101B-9397-08002B2CF9AE}" pid="6" name="Producer">
-    <vt:lpwstr>Microsoft® Excel® 2019</vt:lpwstr>
-  </property>
-</Properties>
-</file>
-
-<file path=word\document.xml><?xml version="1.0" encoding="utf-8"?>
+<file path=word/document.xml><?xml version="1.0" encoding="utf-8"?>
 <w:document xmlns:mc="http://schemas.openxmlformats.org/markup-compatibility/2006" xmlns:ve="http://schemas.openxmlformats.org/markup-compatibility/2006" xmlns:o="urn:schemas-microsoft-com:office:office" xmlns:r="http://schemas.openxmlformats.org/officeDocument/2006/relationships" xmlns:m="http://schemas.openxmlformats.org/officeDocument/2006/math" xmlns:v="urn:schemas-microsoft-com:vml" xmlns:wp="http://schemas.openxmlformats.org/drawingml/2006/wordprocessingDrawing" xmlns:w10="urn:schemas-microsoft-com:office:word" xmlns:w="http://schemas.openxmlformats.org/wordprocessingml/2006/main" xmlns:wne="http://schemas.microsoft.com/office/word/2006/wordml" xmlns:a="http://schemas.openxmlformats.org/drawingml/2006/main" xmlns:pic="http://schemas.openxmlformats.org/drawingml/2006/picture" xmlns:wpg="http://schemas.microsoft.com/office/word/2010/wordprocessingGroup" xmlns:wps="http://schemas.microsoft.com/office/word/2010/wordprocessingShape" xmlns:w14="http://schemas.microsoft.com/office/word/2010/wordml" mc:Ignorable="w14" xml:space="preserve">
   <w:body>
     <w:p>
@@ -941,6 +899,9 @@
             <w:gridSpan w:val="4"/>
           </w:tcPr>
           <w:p>
+            <w:r>
+              <w:t>{NguoiGiaoDich}</w:t>
+            </w:r>
             <w:r>
               <w:t>{BenBDaiDien}</w:t>
             </w:r>
@@ -1802,6 +1763,46 @@
           <w:p/>
         </w:tc>
       </w:tr>
+    </w:tbl>
+    <w:p>
+      <w:pPr>
+        <w:pStyle w:val="Normal"/>
+      </w:pPr>
+    </w:p>
+    <w:tbl>
+      <w:tblPr>
+        <w:tblW w:w="0" w:type="auto"/>
+        <w:jc w:val="left"/>
+        <w:tblInd w:w="106" w:type="dxa"/>
+        <w:tblBorders>
+          <w:top w:val="single" w:sz="2" w:space="0" w:color="000000"/>
+          <w:left w:val="single" w:sz="2" w:space="0" w:color="000000"/>
+          <w:bottom w:val="single" w:sz="2" w:space="0" w:color="000000"/>
+          <w:right w:val="single" w:sz="2" w:space="0" w:color="000000"/>
+          <w:insideH w:val="single" w:sz="2" w:space="0" w:color="000000"/>
+          <w:insideV w:val="single" w:sz="2" w:space="0" w:color="000000"/>
+        </w:tblBorders>
+        <w:tblLayout w:type="fixed"/>
+        <w:tblCellMar>
+          <w:top w:w="0" w:type="dxa"/>
+          <w:left w:w="0" w:type="dxa"/>
+          <w:bottom w:w="0" w:type="dxa"/>
+          <w:right w:w="0" w:type="dxa"/>
+        </w:tblCellMar>
+        <w:tblLook w:val="01E0"/>
+      </w:tblPr>
+      <w:tblGrid>
+        <w:gridCol w:w="900"/>
+        <w:gridCol w:w="810"/>
+        <w:gridCol w:w="392"/>
+        <w:gridCol w:w="591"/>
+        <w:gridCol w:w="1082"/>
+        <w:gridCol w:w="862"/>
+        <w:gridCol w:w="829"/>
+        <w:gridCol w:w="843"/>
+        <w:gridCol w:w="1472"/>
+        <w:gridCol w:w="1264"/>
+      </w:tblGrid>
     </w:tbl>
     <w:p>
       <w:pPr>
@@ -4489,18 +4490,7 @@
 </w:document>
 </file>
 
-<file path=word\fontTable.xml><?xml version="1.0" encoding="utf-8"?>
-<w:fonts xmlns:r="http://schemas.openxmlformats.org/officeDocument/2006/relationships" xmlns:w="http://schemas.openxmlformats.org/wordprocessingml/2006/main">
-  <w:font w:name="Times New Roman">
-    <w:altName w:val="Times New Roman"/>
-    <w:charset w:val="1"/>
-    <w:family w:val="roman"/>
-    <w:pitch w:val="variable"/>
-  </w:font>
-</w:fonts>
-</file>
-
-<file path=word\numbering.xml><?xml version="1.0" encoding="utf-8"?>
+<file path=word/numbering.xml><?xml version="1.0" encoding="utf-8"?>
 <w:numbering xmlns:ve="http://schemas.openxmlformats.org/markup-compatibility/2006" xmlns:o="urn:schemas-microsoft-com:office:office" xmlns:r="http://schemas.openxmlformats.org/officeDocument/2006/relationships" xmlns:m="http://schemas.openxmlformats.org/officeDocument/2006/math" xmlns:v="urn:schemas-microsoft-com:vml" xmlns:wp="http://schemas.openxmlformats.org/drawingml/2006/wordprocessingDrawing" xmlns:w10="urn:schemas-microsoft-com:office:word" xmlns:w="http://schemas.openxmlformats.org/wordprocessingml/2006/main" xmlns:wne="http://schemas.microsoft.com/office/word/2006/wordml">
   <w:abstractNum w:abstractNumId="3">
     <w:multiLevelType w:val="hybridMultilevel"/>
@@ -5024,23 +5014,7 @@
 </w:numbering>
 </file>
 
-<file path=word\settings.xml><?xml version="1.0" encoding="utf-8"?>
-<w:settings xmlns:o="urn:schemas-microsoft-com:office:office" xmlns:r="http://schemas.openxmlformats.org/officeDocument/2006/relationships" xmlns:m="http://schemas.openxmlformats.org/officeDocument/2006/math" xmlns:v="urn:schemas-microsoft-com:vml" xmlns:w10="urn:schemas-microsoft-com:office:word" xmlns:w="http://schemas.openxmlformats.org/wordprocessingml/2006/main" xmlns:sl="http://schemas.openxmlformats.org/schemaLibrary/2006/main">
-  <w:zoom w:percent="120"/>
-  <w:defaultTabStop w:val="720"/>
-  <w:drawingGridHorizontalSpacing w:val="110"/>
-  <w:displayHorizontalDrawingGridEvery w:val="2"/>
-  <w:characterSpacingControl w:val="doNotCompress"/>
-  <w:compat>
-    <w:ulTrailSpace/>
-    <w:shapeLayoutLikeWW8/>
-    <w:useFELayout/>
-    <w:compatSetting w:val="14" w:uri="http://schemas.microsoft.com/office/word" w:name="compatibilityMode"/>
-  </w:compat>
-</w:settings>
-</file>
-
-<file path=word\styles.xml><?xml version="1.0" encoding="utf-8"?>
+<file path=word/styles.xml><?xml version="1.0" encoding="utf-8"?>
 <w:styles xmlns:r="http://schemas.openxmlformats.org/officeDocument/2006/relationships" xmlns:w="http://schemas.openxmlformats.org/wordprocessingml/2006/main">
   <w:docDefaults>
     <w:rPrDefault>
@@ -5123,7 +5097,7 @@
 </w:styles>
 </file>
 
-<file path=word\theme\theme1.xml><?xml version="1.0" encoding="utf-8"?>
+<file path=word/theme/theme1.xml><?xml version="1.0" encoding="utf-8"?>
 <a:theme xmlns:a="http://schemas.openxmlformats.org/drawingml/2006/main" name="Office Theme">
   <a:themeElements>
     <a:clrScheme name="Office">

</xml_diff>

<commit_message>
feat: initialize backend server with document generation support and template management APIs
</commit_message>
<xml_diff>
--- a/backend-app/samples/BEO_Hoi_Nghi.docx
+++ b/backend-app/samples/BEO_Hoi_Nghi.docx
@@ -2831,7 +2831,7 @@
           </w:tcPr>
           <w:p>
             <w:r>
-              <w:t>{@NoteKyThuat}</w:t>
+              <w:t>{NoteKyThuat}</w:t>
             </w:r>
           </w:p>
         </w:tc>
@@ -3132,7 +3132,7 @@
           </w:tcPr>
           <w:p>
             <w:r>
-              <w:t>{@LuuY}</w:t>
+              <w:t>{LuuY}</w:t>
             </w:r>
           </w:p>
         </w:tc>
@@ -3339,7 +3339,7 @@
           </w:tcPr>
           <w:p>
             <w:r>
-              <w:t>{@ThongTinSetup}</w:t>
+              <w:t>{ThongTinSetup}</w:t>
             </w:r>
           </w:p>
         </w:tc>
@@ -3543,7 +3543,7 @@
           </w:tcPr>
           <w:p>
             <w:r>
-              <w:t>{@NoteBaoVe}</w:t>
+              <w:t>{NoteBaoVe}</w:t>
             </w:r>
           </w:p>
         </w:tc>
@@ -3643,7 +3643,7 @@
           </w:tcPr>
           <w:p>
             <w:r>
-              <w:t>{@NoteKyThuat}</w:t>
+              <w:t>{NoteKyThuat}</w:t>
             </w:r>
           </w:p>
         </w:tc>
@@ -3765,7 +3765,7 @@
           </w:tcPr>
           <w:p>
             <w:r>
-              <w:t>{@NoteBieuNgu}</w:t>
+              <w:t>{NoteBieuNgu}</w:t>
             </w:r>
           </w:p>
         </w:tc>
@@ -3809,7 +3809,7 @@
           </w:tcPr>
           <w:p>
             <w:r>
-              <w:t>{@NoteLobby}</w:t>
+              <w:t>{NoteLobby}</w:t>
             </w:r>
           </w:p>
         </w:tc>

</xml_diff>